<commit_message>
Stardust Engine CMS now has a home on GitHub
</commit_message>
<xml_diff>
--- a/_workspace/books/aubrie/The Story Bible.docx
+++ b/_workspace/books/aubrie/The Story Bible.docx
@@ -364,7 +364,10 @@
         </w:numPr>
       </w:pPr>
       <w:r>
-        <w:t>Zoe Wren Brooks (Bed B, lower bunk Twin XL)</w:t>
+        <w:t>Zoë</w:t>
+      </w:r>
+      <w:r>
+        <w:t xml:space="preserve"> Wren Brooks (Bed B, lower bunk Twin XL)</w:t>
       </w:r>
     </w:p>
     <w:p>
@@ -376,7 +379,13 @@
         </w:numPr>
       </w:pPr>
       <w:r>
-        <w:t>The pragmatic and efficient Zoe occupies the practical lower bunk.</w:t>
+        <w:t xml:space="preserve">The pragmatic and efficient </w:t>
+      </w:r>
+      <w:r>
+        <w:t>Zoë</w:t>
+      </w:r>
+      <w:r>
+        <w:t xml:space="preserve"> occupies the practical lower bunk.</w:t>
       </w:r>
     </w:p>
     <w:p>
@@ -1529,7 +1538,21 @@
           <w:b/>
           <w:bCs/>
         </w:rPr>
-        <w:t>4. Zoe Wren Brooks</w:t>
+        <w:t xml:space="preserve">4. </w:t>
+      </w:r>
+      <w:r>
+        <w:rPr>
+          <w:b/>
+          <w:bCs/>
+        </w:rPr>
+        <w:t>Zoë</w:t>
+      </w:r>
+      <w:r>
+        <w:rPr>
+          <w:b/>
+          <w:bCs/>
+        </w:rPr>
+        <w:t xml:space="preserve"> Wren Brooks</w:t>
       </w:r>
     </w:p>
     <w:p>
@@ -2480,7 +2503,14 @@
           <w:b/>
           <w:bCs/>
         </w:rPr>
-        <w:t>Zoe Wren Brooks:</w:t>
+        <w:t>Zoë</w:t>
+      </w:r>
+      <w:r>
+        <w:rPr>
+          <w:b/>
+          <w:bCs/>
+        </w:rPr>
+        <w:t xml:space="preserve"> Wren Brooks:</w:t>
       </w:r>
       <w:r>
         <w:t xml:space="preserve"> A pragmatic, logical suitemate from Christiansburg, VA. She often takes the lead in planning and logistics for the group. She also has strong romantic feelings for Jordan.</w:t>
@@ -3264,17 +3294,14 @@
           <w:i/>
           <w:iCs/>
         </w:rPr>
-        <w:t>Zoe: Thermodynamics</w:t>
-      </w:r>
-      <w:r>
-        <w:t xml:space="preserve">, </w:t>
+        <w:t>Zoë</w:t>
       </w:r>
       <w:r>
         <w:rPr>
           <w:i/>
           <w:iCs/>
         </w:rPr>
-        <w:t>Mark: Statics</w:t>
+        <w:t>: Thermodynamics</w:t>
       </w:r>
       <w:r>
         <w:t xml:space="preserve">, </w:t>
@@ -3284,7 +3311,7 @@
           <w:i/>
           <w:iCs/>
         </w:rPr>
-        <w:t>Hannah: Organic Chemistry I</w:t>
+        <w:t>Mark: Statics</w:t>
       </w:r>
       <w:r>
         <w:t xml:space="preserve">, </w:t>
@@ -3294,43 +3321,53 @@
           <w:i/>
           <w:iCs/>
         </w:rPr>
-        <w:t>Lauren: Typography I</w:t>
-      </w:r>
-      <w:r>
-        <w:t>).</w:t>
-      </w:r>
-    </w:p>
-    <w:p>
-      <w:pPr>
-        <w:pStyle w:val="Heading6"/>
-      </w:pPr>
-      <w:r>
-        <w:t>Spring 2017 Semester</w:t>
-      </w:r>
-    </w:p>
-    <w:p>
-      <w:pPr>
-        <w:pStyle w:val="ListParagraph"/>
-        <w:numPr>
-          <w:ilvl w:val="0"/>
-          <w:numId w:val="55"/>
-        </w:numPr>
-      </w:pPr>
-      <w:r>
-        <w:rPr>
-          <w:b/>
-          <w:bCs/>
-        </w:rPr>
-        <w:t>[Group of 8]:</w:t>
-      </w:r>
-      <w:r>
-        <w:t xml:space="preserve"> CINE 205 (Introduction to Film Studies) - </w:t>
+        <w:t>Hannah: Organic Chemistry I</w:t>
+      </w:r>
+      <w:r>
+        <w:t xml:space="preserve">, </w:t>
       </w:r>
       <w:r>
         <w:rPr>
           <w:i/>
           <w:iCs/>
         </w:rPr>
+        <w:t>Lauren: Typography I</w:t>
+      </w:r>
+      <w:r>
+        <w:t>).</w:t>
+      </w:r>
+    </w:p>
+    <w:p>
+      <w:pPr>
+        <w:pStyle w:val="Heading6"/>
+      </w:pPr>
+      <w:r>
+        <w:t>Spring 2017 Semester</w:t>
+      </w:r>
+    </w:p>
+    <w:p>
+      <w:pPr>
+        <w:pStyle w:val="ListParagraph"/>
+        <w:numPr>
+          <w:ilvl w:val="0"/>
+          <w:numId w:val="55"/>
+        </w:numPr>
+      </w:pPr>
+      <w:r>
+        <w:rPr>
+          <w:b/>
+          <w:bCs/>
+        </w:rPr>
+        <w:t>[Group of 8]:</w:t>
+      </w:r>
+      <w:r>
+        <w:t xml:space="preserve"> CINE 205 (Introduction to Film Studies) - </w:t>
+      </w:r>
+      <w:r>
+        <w:rPr>
+          <w:i/>
+          <w:iCs/>
+        </w:rPr>
         <w:t>Fulfills their final arts &amp; humanities requirement.</w:t>
       </w:r>
     </w:p>
@@ -3506,7 +3543,13 @@
         <w:t>Daniel and Laura Brooks:</w:t>
       </w:r>
       <w:r>
-        <w:t xml:space="preserve"> Zoe's supportive and loving parents from Christiansburg (later Blacksburg). They become Jordan's chosen parental figures and emergency contacts, providing the ultimate safe harbor for the entire group.</w:t>
+        <w:t xml:space="preserve"> </w:t>
+      </w:r>
+      <w:r>
+        <w:t>Zoë</w:t>
+      </w:r>
+      <w:r>
+        <w:t>'s supportive and loving parents from Christiansburg (later Blacksburg). They become Jordan's chosen parental figures and emergency contacts, providing the ultimate safe harbor for the entire group.</w:t>
       </w:r>
     </w:p>
     <w:p>
@@ -3525,7 +3568,13 @@
         <w:t>The Brooks Siblings:</w:t>
       </w:r>
       <w:r>
-        <w:t xml:space="preserve"> Zoe's six older siblings: Megan, Chloe (married name: Chloe Brooks Carter), Caleb, Lucas, Owen, and Jacob. They are all part of the extended family support system.</w:t>
+        <w:t xml:space="preserve"> </w:t>
+      </w:r>
+      <w:r>
+        <w:t>Zoë</w:t>
+      </w:r>
+      <w:r>
+        <w:t>'s six older siblings: Megan, Chloe (married name: Chloe Brooks Carter), Caleb, Lucas, Owen, and Jacob. They are all part of the extended family support system.</w:t>
       </w:r>
     </w:p>
     <w:p>
@@ -3750,7 +3799,13 @@
     </w:p>
     <w:p>
       <w:r>
-        <w:t>The core philosophy of the group. The single women (Aubrie, Madison, Zoe, Lauren, Sarah) are free to be romantically and intimately involved with Jordan with Aubrie's full blessing. A key component is the "Hug Ritual," where handoffs between Jordan and his female companions are always accompanied by a goodbye and a hello hug, which serves as a grounding mechanism for him.</w:t>
+        <w:t xml:space="preserve">The core philosophy of the group. The single women (Aubrie, Madison, </w:t>
+      </w:r>
+      <w:r>
+        <w:t>Zoë</w:t>
+      </w:r>
+      <w:r>
+        <w:t>, Lauren, Sarah) are free to be romantically and intimately involved with Jordan with Aubrie's full blessing. A key component is the "Hug Ritual," where handoffs between Jordan and his female companions are always accompanied by a goodbye and a hello hug, which serves as a grounding mechanism for him.</w:t>
       </w:r>
       <w:r>
         <w:t xml:space="preserve"> This hug ritual will later extend to Mark after he assists Jordan in a way that his female companions would never be allowed to: a public men’s restroom where there is no nearby gender neutral restroom.</w:t>
@@ -8494,7 +8549,13 @@
         <w:t>Chapter 10.5 (The First Kiss):</w:t>
       </w:r>
       <w:r>
-        <w:t xml:space="preserve"> Jordan shares his first kiss, which escalates into a night of making out, first with Aubrie, then Madison, then Zoe, all with Aubrie's blessing.</w:t>
+        <w:t xml:space="preserve"> Jordan shares his first kiss, which escalates into a night of making out, first with Aubrie, then Madison, then </w:t>
+      </w:r>
+      <w:r>
+        <w:t>Zoë</w:t>
+      </w:r>
+      <w:r>
+        <w:t>, all with Aubrie's blessing.</w:t>
       </w:r>
     </w:p>
     <w:p>
@@ -8775,7 +8836,14 @@
           <w:b/>
           <w:bCs/>
         </w:rPr>
-        <w:t>Zoe Brooks:</w:t>
+        <w:t>Zoë</w:t>
+      </w:r>
+      <w:r>
+        <w:rPr>
+          <w:b/>
+          <w:bCs/>
+        </w:rPr>
+        <w:t xml:space="preserve"> Brooks:</w:t>
       </w:r>
       <w:r>
         <w:t xml:space="preserve"> </w:t>
@@ -9442,7 +9510,10 @@
         <w:pStyle w:val="Heading2"/>
       </w:pPr>
       <w:r>
-        <w:t>Zoe Wren Brooks</w:t>
+        <w:t>Zoë</w:t>
+      </w:r>
+      <w:r>
+        <w:t xml:space="preserve"> Wren Brooks</w:t>
       </w:r>
     </w:p>
     <w:p>
@@ -10403,7 +10474,13 @@
         </w:numPr>
       </w:pPr>
       <w:r>
-        <w:t xml:space="preserve">   * Zoe, Madison, Lauren, and Sarah will often refer to Jordan as their "husband" in casual, private conversation, and he will refer to them as his "wives."</w:t>
+        <w:t xml:space="preserve">   * </w:t>
+      </w:r>
+      <w:r>
+        <w:t>Zoë</w:t>
+      </w:r>
+      <w:r>
+        <w:t>, Madison, Lauren, and Sarah will often refer to Jordan as their "husband" in casual, private conversation, and he will refer to them as his "wives."</w:t>
       </w:r>
     </w:p>
     <w:p>
@@ -11305,15 +11382,7 @@
     </w:p>
     <w:p>
       <w:r>
-        <w:t xml:space="preserve">They returned to </w:t>
-      </w:r>
-      <w:proofErr w:type="gramStart"/>
-      <w:r>
-        <w:t>the Brooks</w:t>
-      </w:r>
-      <w:proofErr w:type="gramEnd"/>
-      <w:r>
-        <w:t>' house that evening, tired, laden with shopping bags, but buzzing with the energy of a successful mission. After stowing their new treasures, they all collapsed in their fortress in the basement, full and happy, with no classes or work to worry about.</w:t>
+        <w:t>They returned to the Brooks' house that evening, tired, laden with shopping bags, but buzzing with the energy of a successful mission. After stowing their new treasures, they all collapsed in their fortress in the basement, full and happy, with no classes or work to worry about.</w:t>
       </w:r>
     </w:p>
     <w:p>
@@ -11350,7 +11419,13 @@
     </w:p>
     <w:p>
       <w:r>
-        <w:t xml:space="preserve">It was Mark's turn. "Zoe, truth or dare?" "Dare," she said, a small, competitive smile on her face. "I dare you to give a promo, </w:t>
+        <w:t>It was Mark's turn. "</w:t>
+      </w:r>
+      <w:r>
+        <w:t>Zoë</w:t>
+      </w:r>
+      <w:r>
+        <w:t xml:space="preserve">, truth or dare?" "Dare," she said, a small, competitive smile on her face. "I dare you to give a promo, </w:t>
       </w:r>
       <w:proofErr w:type="gramStart"/>
       <w:r>
@@ -11358,12 +11433,24 @@
       </w:r>
       <w:proofErr w:type="gramEnd"/>
       <w:r>
-        <w:t xml:space="preserve"> the refrigerator, responding to Dr. Destruction's challenge." Zoe stood, and in a surprisingly deep and booming voice, delivered a promo about the "ice-cold fury" and "chilling power" of the Kenmore Elite, promising that Dr. Destruction's reign would be put on ice. The performance was so unexpected and brilliant that everyone was crying with laughter.</w:t>
-      </w:r>
-    </w:p>
-    <w:p>
-      <w:r>
-        <w:t>"Lauren, truth or dare?" Zoe asked, her analytical glint returning. "Truth," Lauren said, feeling brave. "Who is a better kisser: your ex-boyfriend, or Jordan?" A chorus of "</w:t>
+        <w:t xml:space="preserve"> the refrigerator, responding to Dr. Destruction's challenge." </w:t>
+      </w:r>
+      <w:r>
+        <w:t>Zoë</w:t>
+      </w:r>
+      <w:r>
+        <w:t xml:space="preserve"> stood, and in a surprisingly deep and booming voice, delivered a promo about the "ice-cold fury" and "chilling power" of the Kenmore Elite, promising that Dr. Destruction's reign would be put on ice. The performance was so unexpected and brilliant that everyone was crying with laughter.</w:t>
+      </w:r>
+    </w:p>
+    <w:p>
+      <w:r>
+        <w:t xml:space="preserve">"Lauren, truth or dare?" </w:t>
+      </w:r>
+      <w:r>
+        <w:t>Zoë</w:t>
+      </w:r>
+      <w:r>
+        <w:t xml:space="preserve"> asked, her analytical glint returning. "Truth," Lauren said, feeling brave. "Who is a better kisser: your ex-boyfriend, or Jordan?" A chorus of "</w:t>
       </w:r>
       <w:proofErr w:type="spellStart"/>
       <w:r>
@@ -11534,7 +11621,13 @@
     </w:p>
     <w:p>
       <w:r>
-        <w:t>The long drive back to Norfolk was a new kind of torture for Aubrey. As the miles stretched on, the initial, raw trauma began to cool, replaced by a cold, creeping dread. He started to replay the night in his head, but this time, he also remembered the months before it. He remembered Lauren's kindness, Hannah's protection, Madison's laughter, Zoe's fierce loyalty. He remembered Aubrie's hand in his, a safe harbor in the dark. He wondered what his life might have been like if they'd just watched a movie instead. By the time they crossed into Norfolk, he realized with a sickening certainty that he did want to hear their apology. He wanted to forgive them. He wanted to go back.</w:t>
+        <w:t xml:space="preserve">The long drive back to Norfolk was a new kind of torture for Aubrey. As the miles stretched on, the initial, raw trauma began to cool, replaced by a cold, creeping dread. He started to replay the night in his head, but this time, he also remembered the months before it. He remembered Lauren's kindness, Hannah's protection, Madison's laughter, </w:t>
+      </w:r>
+      <w:r>
+        <w:t>Zoë</w:t>
+      </w:r>
+      <w:r>
+        <w:t>'s fierce loyalty. He remembered Aubrie's hand in his, a safe harbor in the dark. He wondered what his life might have been like if they'd just watched a movie instead. By the time they crossed into Norfolk, he realized with a sickening certainty that he did want to hear their apology. He wanted to forgive them. He wanted to go back.</w:t>
       </w:r>
     </w:p>
     <w:p>
@@ -11568,15 +11661,7 @@
     </w:p>
     <w:p>
       <w:r>
-        <w:t xml:space="preserve">They returned to </w:t>
-      </w:r>
-      <w:proofErr w:type="gramStart"/>
-      <w:r>
-        <w:t>the Brooks</w:t>
-      </w:r>
-      <w:proofErr w:type="gramEnd"/>
-      <w:r>
-        <w:t>' house that evening, tired, laden with shopping bags, but buzzing with the energy of a successful mission. After stowing their new treasures, they all collapsed in their fortress in the basement, full and happy, with no classes or work to worry about.</w:t>
+        <w:t>They returned to the Brooks' house that evening, tired, laden with shopping bags, but buzzing with the energy of a successful mission. After stowing their new treasures, they all collapsed in their fortress in the basement, full and happy, with no classes or work to worry about.</w:t>
       </w:r>
     </w:p>
     <w:p>
@@ -11613,7 +11698,13 @@
     </w:p>
     <w:p>
       <w:r>
-        <w:t xml:space="preserve">It was Mark's turn. "Zoe, truth or dare?" "Dare," she said, a small, competitive smile on her face. "I dare you to give a promo, </w:t>
+        <w:t>It was Mark's turn. "</w:t>
+      </w:r>
+      <w:r>
+        <w:t>Zoë</w:t>
+      </w:r>
+      <w:r>
+        <w:t xml:space="preserve">, truth or dare?" "Dare," she said, a small, competitive smile on her face. "I dare you to give a promo, </w:t>
       </w:r>
       <w:proofErr w:type="gramStart"/>
       <w:r>
@@ -11621,12 +11712,24 @@
       </w:r>
       <w:proofErr w:type="gramEnd"/>
       <w:r>
-        <w:t xml:space="preserve"> the refrigerator, responding to Dr. Destruction's challenge." Zoe stood, and in a surprisingly deep and booming voice, delivered a promo about the "ice-cold fury" and "chilling power" of the Kenmore Elite, promising that Dr. Destruction's reign would be put on ice. The performance was so unexpected and brilliant that everyone was crying with laughter.</w:t>
-      </w:r>
-    </w:p>
-    <w:p>
-      <w:r>
-        <w:t>"Lauren, truth or dare?" Zoe asked, her analytical glint returning. "Truth," Lauren said, feeling brave. "Who is a better kisser: your ex-boyfriend, or Jordan?" A chorus of "</w:t>
+        <w:t xml:space="preserve"> the refrigerator, responding to Dr. Destruction's challenge." </w:t>
+      </w:r>
+      <w:r>
+        <w:t>Zoë</w:t>
+      </w:r>
+      <w:r>
+        <w:t xml:space="preserve"> stood, and in a surprisingly deep and booming voice, delivered a promo about the "ice-cold fury" and "chilling power" of the Kenmore Elite, promising that Dr. Destruction's reign would be put on ice. The performance was so unexpected and brilliant that everyone was crying with laughter.</w:t>
+      </w:r>
+    </w:p>
+    <w:p>
+      <w:r>
+        <w:t xml:space="preserve">"Lauren, truth or dare?" </w:t>
+      </w:r>
+      <w:r>
+        <w:t>Zoë</w:t>
+      </w:r>
+      <w:r>
+        <w:t xml:space="preserve"> asked, her analytical glint returning. "Truth," Lauren said, feeling brave. "Who is a better kisser: your ex-boyfriend, or Jordan?" A chorus of "</w:t>
       </w:r>
       <w:proofErr w:type="spellStart"/>
       <w:r>
@@ -11794,7 +11897,13 @@
     </w:p>
     <w:p>
       <w:r>
-        <w:t>The long drive back to Norfolk was a new kind of torture for Aubrey. As the miles stretched on, the initial, raw trauma began to cool, replaced by a cold, creeping dread. He started to replay the night in his head, but this time, he also remembered the months before it. He remembered Lauren's kindness, Hannah's protection, Madison's laughter, Zoe's fierce loyalty. He remembered Aubrie's hand in his, a safe harbor in the dark. He wondered what his life might have been like if they'd just watched a movie instead. By the time they crossed into Norfolk, he realized with a sickening certainty that he did want to hear their apology. He wanted to forgive them. He wanted to go back.</w:t>
+        <w:t xml:space="preserve">The long drive back to Norfolk was a new kind of torture for Aubrey. As the miles stretched on, the initial, raw trauma began to cool, replaced by a cold, creeping dread. He started to replay the night in his head, but this time, he also remembered the months before it. He remembered Lauren's kindness, Hannah's protection, Madison's laughter, </w:t>
+      </w:r>
+      <w:r>
+        <w:t>Zoë</w:t>
+      </w:r>
+      <w:r>
+        <w:t>'s fierce loyalty. He remembered Aubrie's hand in his, a safe harbor in the dark. He wondered what his life might have been like if they'd just watched a movie instead. By the time they crossed into Norfolk, he realized with a sickening certainty that he did want to hear their apology. He wanted to forgive them. He wanted to go back.</w:t>
       </w:r>
     </w:p>
     <w:p>
@@ -11928,7 +12037,13 @@
     </w:p>
     <w:p>
       <w:r>
-        <w:t>With practiced efficiency, they moved into action. Zoe and Lauren directed the packing of his few possessions. It took less than fifteen minutes.</w:t>
+        <w:t xml:space="preserve">With practiced efficiency, they moved into action. </w:t>
+      </w:r>
+      <w:r>
+        <w:t>Zoë</w:t>
+      </w:r>
+      <w:r>
+        <w:t xml:space="preserve"> and Lauren directed the packing of his few possessions. It took less than fifteen minutes.</w:t>
       </w:r>
     </w:p>
     <w:p>
@@ -11960,7 +12075,13 @@
       </w:r>
       <w:proofErr w:type="gramEnd"/>
       <w:r>
-        <w:t xml:space="preserve"> what do we do now?" Zoe asked, her voice full of a new, sober understanding. "How do we make sure this never, ever happens again?"</w:t>
+        <w:t xml:space="preserve"> what do we do now?" </w:t>
+      </w:r>
+      <w:r>
+        <w:t>Zoë</w:t>
+      </w:r>
+      <w:r>
+        <w:t xml:space="preserve"> asked, her voice full of a new, sober understanding. "How do we make sure this never, ever happens again?"</w:t>
       </w:r>
     </w:p>
     <w:p>
@@ -12024,59 +12145,63 @@
     </w:p>
     <w:p>
       <w:r>
-        <w:t xml:space="preserve">They returned to </w:t>
+        <w:t>They returned to the Brooks' house that evening, tired, laden with shopping bags, but buzzing with the energy of a successful mission. After stowing their new treasures, they all collapsed in their fortress in the basement, full and happy, with no classes or work to worry about.</w:t>
+      </w:r>
+    </w:p>
+    <w:p>
+      <w:r>
+        <w:t>"Okay, I'm officially too tired to move, but too hyped up to sleep," Madison announced, sitting up from her air mattress. "This is a once-in-a-lifetime opportunity for a massive game of Truth or Dare!"</w:t>
+      </w:r>
+    </w:p>
+    <w:p>
+      <w:r>
+        <w:t>The group sat in a big circle on the floor, the air buzzing with playful energy.</w:t>
+      </w:r>
+    </w:p>
+    <w:p>
+      <w:r>
+        <w:t xml:space="preserve">"Okay, Mark, truth or dare?" Madison began. "Dare, obviously," he shot back with a grin. "I dare you to </w:t>
       </w:r>
       <w:proofErr w:type="gramStart"/>
       <w:r>
-        <w:t>the Brooks</w:t>
+        <w:t>do</w:t>
       </w:r>
       <w:proofErr w:type="gramEnd"/>
       <w:r>
-        <w:t>' house that evening, tired, laden with shopping bags, but buzzing with the energy of a successful mission. After stowing their new treasures, they all collapsed in their fortress in the basement, full and happy, with no classes or work to worry about.</w:t>
-      </w:r>
-    </w:p>
-    <w:p>
-      <w:r>
-        <w:t>"Okay, I'm officially too tired to move, but too hyped up to sleep," Madison announced, sitting up from her air mattress. "This is a once-in-a-lifetime opportunity for a massive game of Truth or Dare!"</w:t>
-      </w:r>
-    </w:p>
-    <w:p>
-      <w:r>
-        <w:t>The group sat in a big circle on the floor, the air buzzing with playful energy.</w:t>
-      </w:r>
-    </w:p>
-    <w:p>
-      <w:r>
-        <w:t xml:space="preserve">"Okay, Mark, truth or dare?" Madison began. "Dare, obviously," he shot back with a grin. "I dare you to </w:t>
+        <w:t xml:space="preserve"> your best impression of Dr. </w:t>
       </w:r>
       <w:proofErr w:type="gramStart"/>
       <w:r>
-        <w:t>do</w:t>
+        <w:t>Destruction</w:t>
       </w:r>
       <w:proofErr w:type="gramEnd"/>
       <w:r>
-        <w:t xml:space="preserve"> your best impression of Dr. </w:t>
+        <w:t xml:space="preserve"> cutting a promo about conquering the kitchen." Mark jumped to his feet, puffing out his chest and launching into a hilariously over-the-top, gravelly-voiced monologue about how the refrigerator would "feel his wrath," which had the entire group in stitches.</w:t>
+      </w:r>
+    </w:p>
+    <w:p>
+      <w:r>
+        <w:t>It was Mark's turn. "</w:t>
+      </w:r>
+      <w:r>
+        <w:t>Zoë</w:t>
+      </w:r>
+      <w:r>
+        <w:t xml:space="preserve">, truth or dare?" "Dare," she said, a small, competitive smile on her face. "I dare you to give a promo, </w:t>
       </w:r>
       <w:proofErr w:type="gramStart"/>
       <w:r>
-        <w:t>Destruction</w:t>
+        <w:t>as</w:t>
       </w:r>
       <w:proofErr w:type="gramEnd"/>
       <w:r>
-        <w:t xml:space="preserve"> cutting a promo about conquering the kitchen." Mark jumped to his feet, puffing out his chest and launching into a hilariously over-the-top, gravelly-voiced monologue about how the refrigerator would "feel his wrath," which had the entire group in stitches.</w:t>
-      </w:r>
-    </w:p>
-    <w:p>
-      <w:r>
-        <w:t xml:space="preserve">It was Mark's turn. "Zoe, truth or dare?" "Dare," she said, a small, competitive smile on her face. "I dare you to give a promo, </w:t>
-      </w:r>
-      <w:proofErr w:type="gramStart"/>
-      <w:r>
-        <w:t>as</w:t>
-      </w:r>
-      <w:proofErr w:type="gramEnd"/>
-      <w:r>
-        <w:t xml:space="preserve"> the refrigerator, responding to Dr. Destruction's challenge." Zoe stood, and in a surprisingly deep and booming voice, delivered a promo </w:t>
+        <w:t xml:space="preserve"> the refrigerator, responding to Dr. Destruction's challenge." </w:t>
+      </w:r>
+      <w:r>
+        <w:t>Zoë</w:t>
+      </w:r>
+      <w:r>
+        <w:t xml:space="preserve"> stood, and in a surprisingly deep and booming voice, delivered a promo </w:t>
       </w:r>
       <w:r>
         <w:lastRenderedPageBreak/>
@@ -12085,7 +12210,13 @@
     </w:p>
     <w:p>
       <w:r>
-        <w:t>"Lauren, truth or dare?" Zoe asked, her analytical glint returning. "Truth," Lauren said, feeling brave. "Who is a better kisser: your ex-boyfriend, or Jordan?" A chorus of "</w:t>
+        <w:t xml:space="preserve">"Lauren, truth or dare?" </w:t>
+      </w:r>
+      <w:r>
+        <w:t>Zoë</w:t>
+      </w:r>
+      <w:r>
+        <w:t xml:space="preserve"> asked, her analytical glint returning. "Truth," Lauren said, feeling brave. "Who is a better kisser: your ex-boyfriend, or Jordan?" A chorus of "</w:t>
       </w:r>
       <w:proofErr w:type="spellStart"/>
       <w:r>
@@ -12308,7 +12439,13 @@
       </w:r>
       <w:proofErr w:type="gramEnd"/>
       <w:r>
-        <w:t xml:space="preserve"> what do we do now?" Zoe asked, ever the pragmatist, though her voice was shaky. "How do we make sure this never, ever happens again?"</w:t>
+        <w:t xml:space="preserve"> what do we do now?" </w:t>
+      </w:r>
+      <w:r>
+        <w:t>Zoë</w:t>
+      </w:r>
+      <w:r>
+        <w:t xml:space="preserve"> asked, ever the pragmatist, though her voice was shaky. "How do we make sure this never, ever happens again?"</w:t>
       </w:r>
     </w:p>
     <w:p>
@@ -12429,7 +12566,13 @@
     </w:p>
     <w:p>
       <w:r>
-        <w:t>The relief in the room was a physical thing, a collective, shaky exhale. They didn't hesitate. They moved in as one, a gentle, careful circle of support around his chair. Aubrie, Hannah, Madison, Lauren, Zoe, Sarah, and even Mark. All eight of them. It was a tangle of arms and shoulders, a mess of tear-streaked faces and quiet, comforting murmurs.</w:t>
+        <w:t xml:space="preserve">The relief in the room was a physical thing, a collective, shaky exhale. They didn't hesitate. They moved in as one, a gentle, careful circle of support around his chair. Aubrie, Hannah, Madison, Lauren, </w:t>
+      </w:r>
+      <w:r>
+        <w:t>Zoë</w:t>
+      </w:r>
+      <w:r>
+        <w:t>, Sarah, and even Mark. All eight of them. It was a tangle of arms and shoulders, a mess of tear-streaked faces and quiet, comforting murmurs.</w:t>
       </w:r>
     </w:p>
     <w:p>
@@ -12455,65 +12598,75 @@
     </w:p>
     <w:p>
       <w:r>
-        <w:t xml:space="preserve">They returned to </w:t>
+        <w:t>They returned to the Brooks' house that evening, tired, laden with shopping bags, but buzzing with the energy of a successful mission. After stowing their new treasures, they all collapsed in their fortress in the basement, full and happy, with no classes or work to worry about.</w:t>
+      </w:r>
+    </w:p>
+    <w:p>
+      <w:r>
+        <w:t>"Okay, I'm officially too tired to move, but too hyped up to sleep," Madison announced, sitting up from her air mattress. "This is a once-in-a-lifetime opportunity for a massive game of Truth or Dare!"</w:t>
+      </w:r>
+    </w:p>
+    <w:p>
+      <w:r>
+        <w:t>The group sat in a big circle on the floor, the air buzzing with playful energy.</w:t>
+      </w:r>
+    </w:p>
+    <w:p>
+      <w:r>
+        <w:t xml:space="preserve">"Okay, Mark, truth or dare?" Madison began. "Dare, obviously," he shot back with a grin. "I dare you to </w:t>
       </w:r>
       <w:proofErr w:type="gramStart"/>
       <w:r>
-        <w:t>the Brooks</w:t>
+        <w:t>do</w:t>
       </w:r>
       <w:proofErr w:type="gramEnd"/>
       <w:r>
-        <w:t>' house that evening, tired, laden with shopping bags, but buzzing with the energy of a successful mission. After stowing their new treasures, they all collapsed in their fortress in the basement, full and happy, with no classes or work to worry about.</w:t>
-      </w:r>
-    </w:p>
-    <w:p>
-      <w:r>
-        <w:t>"Okay, I'm officially too tired to move, but too hyped up to sleep," Madison announced, sitting up from her air mattress. "This is a once-in-a-lifetime opportunity for a massive game of Truth or Dare!"</w:t>
-      </w:r>
-    </w:p>
-    <w:p>
-      <w:r>
-        <w:t>The group sat in a big circle on the floor, the air buzzing with playful energy.</w:t>
-      </w:r>
-    </w:p>
-    <w:p>
-      <w:r>
-        <w:t xml:space="preserve">"Okay, Mark, truth or dare?" Madison began. "Dare, obviously," he shot back with a grin. "I dare you to </w:t>
+        <w:t xml:space="preserve"> your best impression of Dr. </w:t>
       </w:r>
       <w:proofErr w:type="gramStart"/>
       <w:r>
-        <w:t>do</w:t>
+        <w:t>Destruction</w:t>
       </w:r>
       <w:proofErr w:type="gramEnd"/>
       <w:r>
-        <w:t xml:space="preserve"> your best impression of Dr. </w:t>
+        <w:t xml:space="preserve"> cutting a promo about conquering the kitchen." Mark jumped to his feet, puffing out his chest and launching into a hilariously over-the-top, gravelly-voiced monologue about how the refrigerator would "feel his wrath," which had the entire group in stitches.</w:t>
+      </w:r>
+    </w:p>
+    <w:p>
+      <w:r>
+        <w:lastRenderedPageBreak/>
+        <w:t>It was Mark's turn. "</w:t>
+      </w:r>
+      <w:r>
+        <w:t>Zoë</w:t>
+      </w:r>
+      <w:r>
+        <w:t xml:space="preserve">, truth or dare?" "Dare," she said, a small, competitive smile on her face. "I dare you to give a promo, </w:t>
       </w:r>
       <w:proofErr w:type="gramStart"/>
       <w:r>
-        <w:t>Destruction</w:t>
+        <w:t>as</w:t>
       </w:r>
       <w:proofErr w:type="gramEnd"/>
       <w:r>
-        <w:t xml:space="preserve"> cutting a promo about conquering the kitchen." Mark jumped to his feet, puffing out his chest and launching into a hilariously over-the-top, gravelly-voiced monologue about how the refrigerator would "feel his wrath," which had the entire group in stitches.</w:t>
-      </w:r>
-    </w:p>
-    <w:p>
-      <w:r>
-        <w:lastRenderedPageBreak/>
-        <w:t xml:space="preserve">It was Mark's turn. "Zoe, truth or dare?" "Dare," she said, a small, competitive smile on her face. "I dare you to give a promo, </w:t>
-      </w:r>
-      <w:proofErr w:type="gramStart"/>
-      <w:r>
-        <w:t>as</w:t>
-      </w:r>
-      <w:proofErr w:type="gramEnd"/>
-      <w:r>
-        <w:t xml:space="preserve"> the refrigerator, responding to Dr. Destruction's challenge." Zoe stood, and in a surprisingly deep and booming voice, delivered a promo about the "ice-cold fury" and "chilling power" of the Kenmore Elite, promising that Dr. Destruction's reign would be put on ice. The performance was so unexpected and brilliant that everyone was crying with laughter.</w:t>
-      </w:r>
-    </w:p>
-    <w:p>
-      <w:r>
-        <w:t>"Lauren, truth or dare?" Zoe asked, her analytical glint returning. "Truth," Lauren said, feeling brave. "Who is a better kisser: your ex-boyfriend, or Jordan?" A chorus of "</w:t>
+        <w:t xml:space="preserve"> the refrigerator, responding to Dr. Destruction's challenge." </w:t>
+      </w:r>
+      <w:r>
+        <w:t>Zoë</w:t>
+      </w:r>
+      <w:r>
+        <w:t xml:space="preserve"> stood, and in a surprisingly deep and booming voice, delivered a promo about the "ice-cold fury" and "chilling power" of the Kenmore Elite, promising that Dr. Destruction's reign would be put on ice. The performance was so unexpected and brilliant that everyone was crying with laughter.</w:t>
+      </w:r>
+    </w:p>
+    <w:p>
+      <w:r>
+        <w:t xml:space="preserve">"Lauren, truth or dare?" </w:t>
+      </w:r>
+      <w:r>
+        <w:t>Zoë</w:t>
+      </w:r>
+      <w:r>
+        <w:t xml:space="preserve"> asked, her analytical glint returning. "Truth," Lauren said, feeling brave. "Who is a better kisser: your ex-boyfriend, or Jordan?" A chorus of "</w:t>
       </w:r>
       <w:proofErr w:type="spellStart"/>
       <w:r>
@@ -12676,15 +12829,7 @@
     </w:p>
     <w:p>
       <w:r>
-        <w:t xml:space="preserve">They returned to </w:t>
-      </w:r>
-      <w:proofErr w:type="gramStart"/>
-      <w:r>
-        <w:t>the Brooks</w:t>
-      </w:r>
-      <w:proofErr w:type="gramEnd"/>
-      <w:r>
-        <w:t>' house that evening, tired, laden with shopping bags, but buzzing with the energy of a successful mission. After stowing their new treasures, they all collapsed in their fortress in the basement, full and happy, with no classes or work to worry about.</w:t>
+        <w:t>They returned to the Brooks' house that evening, tired, laden with shopping bags, but buzzing with the energy of a successful mission. After stowing their new treasures, they all collapsed in their fortress in the basement, full and happy, with no classes or work to worry about.</w:t>
       </w:r>
     </w:p>
     <w:p>
@@ -12721,7 +12866,13 @@
     </w:p>
     <w:p>
       <w:r>
-        <w:t xml:space="preserve">It was Mark's turn. "Zoe, truth or dare?" "Dare," she said, a small, competitive smile on her face. "I dare you to give a promo, </w:t>
+        <w:t>It was Mark's turn. "</w:t>
+      </w:r>
+      <w:r>
+        <w:t>Zoë</w:t>
+      </w:r>
+      <w:r>
+        <w:t xml:space="preserve">, truth or dare?" "Dare," she said, a small, competitive smile on her face. "I dare you to give a promo, </w:t>
       </w:r>
       <w:proofErr w:type="gramStart"/>
       <w:r>
@@ -12729,12 +12880,24 @@
       </w:r>
       <w:proofErr w:type="gramEnd"/>
       <w:r>
-        <w:t xml:space="preserve"> the refrigerator, responding to Dr. Destruction's challenge." Zoe stood, and in a surprisingly deep and booming voice, delivered a promo about the "ice-cold fury" and "chilling power" of the Kenmore Elite, promising that Dr. Destruction's reign would be put on ice. The performance was so unexpected and brilliant that everyone was crying with laughter.</w:t>
-      </w:r>
-    </w:p>
-    <w:p>
-      <w:r>
-        <w:t>"Lauren, truth or dare?" Zoe asked, her analytical glint returning. "Truth," Lauren said, feeling brave. "Who is a better kisser: your ex-boyfriend, or Jordan?" A chorus of "</w:t>
+        <w:t xml:space="preserve"> the refrigerator, responding to Dr. Destruction's challenge." </w:t>
+      </w:r>
+      <w:r>
+        <w:t>Zoë</w:t>
+      </w:r>
+      <w:r>
+        <w:t xml:space="preserve"> stood, and in a surprisingly deep and booming voice, delivered a promo about the "ice-cold fury" and "chilling power" of the Kenmore Elite, promising that Dr. Destruction's reign would be put on ice. The performance was so unexpected and brilliant that everyone was crying with laughter.</w:t>
+      </w:r>
+    </w:p>
+    <w:p>
+      <w:r>
+        <w:t xml:space="preserve">"Lauren, truth or dare?" </w:t>
+      </w:r>
+      <w:r>
+        <w:t>Zoë</w:t>
+      </w:r>
+      <w:r>
+        <w:t xml:space="preserve"> asked, her analytical glint returning. "Truth," Lauren said, feeling brave. "Who is a better kisser: your ex-boyfriend, or Jordan?" A chorus of "</w:t>
       </w:r>
       <w:proofErr w:type="spellStart"/>
       <w:r>
@@ -12835,15 +12998,7 @@
     </w:p>
     <w:p>
       <w:r>
-        <w:t xml:space="preserve">"No," she said, her voice quiet but ringing with </w:t>
-      </w:r>
-      <w:proofErr w:type="gramStart"/>
-      <w:r>
-        <w:t>an authority</w:t>
-      </w:r>
-      <w:proofErr w:type="gramEnd"/>
-      <w:r>
-        <w:t xml:space="preserve"> that silenced the entire room.</w:t>
+        <w:t>"No," she said, her voice quiet but ringing with an authority that silenced the entire room.</w:t>
       </w:r>
     </w:p>
     <w:p>
@@ -12896,64 +13051,74 @@
     </w:p>
     <w:p>
       <w:r>
-        <w:t xml:space="preserve">They returned to </w:t>
+        <w:t>They returned to the Brooks' house that evening, tired, laden with shopping bags, but buzzing with the energy of a successful mission. After stowing their new treasures, they all collapsed in their fortress in the basement, full and happy, with no classes or work to worry about.</w:t>
+      </w:r>
+    </w:p>
+    <w:p>
+      <w:r>
+        <w:t>"Okay, I'm officially too tired to move, but too hyped up to sleep," Madison announced, sitting up from her air mattress. "This is a once-in-a-lifetime opportunity for a massive game of Truth or Dare!"</w:t>
+      </w:r>
+    </w:p>
+    <w:p>
+      <w:r>
+        <w:t>The group sat in a big circle on the floor, the air buzzing with playful energy.</w:t>
+      </w:r>
+    </w:p>
+    <w:p>
+      <w:r>
+        <w:t xml:space="preserve">"Okay, Mark, truth or dare?" Madison began. "Dare, obviously," he shot back with a grin. "I dare you to </w:t>
       </w:r>
       <w:proofErr w:type="gramStart"/>
       <w:r>
-        <w:t>the Brooks</w:t>
+        <w:t>do</w:t>
       </w:r>
       <w:proofErr w:type="gramEnd"/>
       <w:r>
-        <w:t>' house that evening, tired, laden with shopping bags, but buzzing with the energy of a successful mission. After stowing their new treasures, they all collapsed in their fortress in the basement, full and happy, with no classes or work to worry about.</w:t>
-      </w:r>
-    </w:p>
-    <w:p>
-      <w:r>
-        <w:t>"Okay, I'm officially too tired to move, but too hyped up to sleep," Madison announced, sitting up from her air mattress. "This is a once-in-a-lifetime opportunity for a massive game of Truth or Dare!"</w:t>
-      </w:r>
-    </w:p>
-    <w:p>
-      <w:r>
-        <w:t>The group sat in a big circle on the floor, the air buzzing with playful energy.</w:t>
-      </w:r>
-    </w:p>
-    <w:p>
-      <w:r>
-        <w:t xml:space="preserve">"Okay, Mark, truth or dare?" Madison began. "Dare, obviously," he shot back with a grin. "I dare you to </w:t>
+        <w:t xml:space="preserve"> your best impression of Dr. </w:t>
       </w:r>
       <w:proofErr w:type="gramStart"/>
       <w:r>
-        <w:t>do</w:t>
+        <w:t>Destruction</w:t>
       </w:r>
       <w:proofErr w:type="gramEnd"/>
       <w:r>
-        <w:t xml:space="preserve"> your best impression of Dr. </w:t>
+        <w:t xml:space="preserve"> cutting a promo about conquering the kitchen." Mark jumped to his feet, puffing out his chest and launching into a hilariously over-the-top, gravelly-voiced monologue about how the refrigerator would "feel his wrath," which had the entire group in stitches.</w:t>
+      </w:r>
+    </w:p>
+    <w:p>
+      <w:r>
+        <w:t>It was Mark's turn. "</w:t>
+      </w:r>
+      <w:r>
+        <w:t>Zoë</w:t>
+      </w:r>
+      <w:r>
+        <w:t xml:space="preserve">, truth or dare?" "Dare," she said, a small, competitive smile on her face. "I dare you to give a promo, </w:t>
       </w:r>
       <w:proofErr w:type="gramStart"/>
       <w:r>
-        <w:t>Destruction</w:t>
+        <w:t>as</w:t>
       </w:r>
       <w:proofErr w:type="gramEnd"/>
       <w:r>
-        <w:t xml:space="preserve"> cutting a promo about conquering the kitchen." Mark jumped to his feet, puffing out his chest and launching into a hilariously over-the-top, gravelly-voiced monologue about how the refrigerator would "feel his wrath," which had the entire group in stitches.</w:t>
-      </w:r>
-    </w:p>
-    <w:p>
-      <w:r>
-        <w:t xml:space="preserve">It was Mark's turn. "Zoe, truth or dare?" "Dare," she said, a small, competitive smile on her face. "I dare you to give a promo, </w:t>
-      </w:r>
-      <w:proofErr w:type="gramStart"/>
-      <w:r>
-        <w:t>as</w:t>
-      </w:r>
-      <w:proofErr w:type="gramEnd"/>
-      <w:r>
-        <w:t xml:space="preserve"> the refrigerator, responding to Dr. Destruction's challenge." Zoe stood, and in a surprisingly deep and booming voice, delivered a promo about the "ice-cold fury" and "chilling power" of the Kenmore Elite, promising that Dr. Destruction's reign would be put on ice. The performance was so unexpected and brilliant that everyone was crying with laughter.</w:t>
-      </w:r>
-    </w:p>
-    <w:p>
-      <w:r>
-        <w:t>"Lauren, truth or dare?" Zoe asked, her analytical glint returning. "Truth," Lauren said, feeling brave. "Who is a better kisser: your ex-boyfriend, or Jordan?" A chorus of "</w:t>
+        <w:t xml:space="preserve"> the refrigerator, responding to Dr. Destruction's challenge." </w:t>
+      </w:r>
+      <w:r>
+        <w:t>Zoë</w:t>
+      </w:r>
+      <w:r>
+        <w:t xml:space="preserve"> stood, and in a surprisingly deep and booming voice, delivered a promo about the "ice-cold fury" and "chilling power" of the Kenmore Elite, promising that Dr. Destruction's reign would be put on ice. The performance was so unexpected and brilliant that everyone was crying with laughter.</w:t>
+      </w:r>
+    </w:p>
+    <w:p>
+      <w:r>
+        <w:t xml:space="preserve">"Lauren, truth or dare?" </w:t>
+      </w:r>
+      <w:r>
+        <w:t>Zoë</w:t>
+      </w:r>
+      <w:r>
+        <w:t xml:space="preserve"> asked, her analytical glint returning. "Truth," Lauren said, feeling brave. "Who is a better kisser: your ex-boyfriend, or Jordan?" A chorus of "</w:t>
       </w:r>
       <w:proofErr w:type="spellStart"/>
       <w:r>
@@ -13043,15 +13208,7 @@
     </w:p>
     <w:p>
       <w:r>
-        <w:t xml:space="preserve">They returned to </w:t>
-      </w:r>
-      <w:proofErr w:type="gramStart"/>
-      <w:r>
-        <w:t>the Brooks</w:t>
-      </w:r>
-      <w:proofErr w:type="gramEnd"/>
-      <w:r>
-        <w:t>' house that evening, tired, laden with shopping bags, but buzzing with the energy of a successful mission. After stowing their new treasures, they all collapsed in their fortress in the basement, full and happy, with no classes or work to worry about.</w:t>
+        <w:t>They returned to the Brooks' house that evening, tired, laden with shopping bags, but buzzing with the energy of a successful mission. After stowing their new treasures, they all collapsed in their fortress in the basement, full and happy, with no classes or work to worry about.</w:t>
       </w:r>
     </w:p>
     <w:p>
@@ -13088,7 +13245,13 @@
     </w:p>
     <w:p>
       <w:r>
-        <w:t xml:space="preserve">It was Mark's turn. "Zoe, truth or dare?" "Dare," she said, a small, competitive smile on her face. "I dare you to give a promo, </w:t>
+        <w:t>It was Mark's turn. "</w:t>
+      </w:r>
+      <w:r>
+        <w:t>Zoë</w:t>
+      </w:r>
+      <w:r>
+        <w:t xml:space="preserve">, truth or dare?" "Dare," she said, a small, competitive smile on her face. "I dare you to give a promo, </w:t>
       </w:r>
       <w:proofErr w:type="gramStart"/>
       <w:r>
@@ -13096,12 +13259,24 @@
       </w:r>
       <w:proofErr w:type="gramEnd"/>
       <w:r>
-        <w:t xml:space="preserve"> the refrigerator, responding to Dr. Destruction's challenge." Zoe stood, and in a surprisingly deep and booming voice, delivered a promo about the "ice-cold fury" and "chilling power" of the Kenmore Elite, promising that Dr. Destruction's reign would be put on ice. The performance was so unexpected and brilliant that everyone was crying with laughter.</w:t>
-      </w:r>
-    </w:p>
-    <w:p>
-      <w:r>
-        <w:t>"Lauren, truth or dare?" Zoe asked, her analytical glint returning. "Truth," Lauren said, feeling brave. "Who is a better kisser: your ex-boyfriend, or Jordan?" A chorus of "</w:t>
+        <w:t xml:space="preserve"> the refrigerator, responding to Dr. Destruction's challenge." </w:t>
+      </w:r>
+      <w:r>
+        <w:t>Zoë</w:t>
+      </w:r>
+      <w:r>
+        <w:t xml:space="preserve"> stood, and in a surprisingly deep and booming voice, delivered a promo about the "ice-cold fury" and "chilling power" of the Kenmore Elite, promising that Dr. Destruction's reign would be put on ice. The performance was so unexpected and brilliant that everyone was crying with laughter.</w:t>
+      </w:r>
+    </w:p>
+    <w:p>
+      <w:r>
+        <w:t xml:space="preserve">"Lauren, truth or dare?" </w:t>
+      </w:r>
+      <w:r>
+        <w:t>Zoë</w:t>
+      </w:r>
+      <w:r>
+        <w:t xml:space="preserve"> asked, her analytical glint returning. "Truth," Lauren said, feeling brave. "Who is a better kisser: your ex-boyfriend, or Jordan?" A chorus of "</w:t>
       </w:r>
       <w:proofErr w:type="spellStart"/>
       <w:r>
@@ -13438,13 +13613,8 @@
       <w:pPr>
         <w:pStyle w:val="Heading1"/>
       </w:pPr>
-      <w:proofErr w:type="gramStart"/>
-      <w:r>
-        <w:t>The Interstate</w:t>
-      </w:r>
-      <w:proofErr w:type="gramEnd"/>
-      <w:r>
-        <w:t xml:space="preserve"> 64 Trigger</w:t>
+      <w:r>
+        <w:t>The Interstate 64 Trigger</w:t>
       </w:r>
     </w:p>
     <w:p>
@@ -13679,13 +13849,8 @@
       <w:r>
         <w:t xml:space="preserve">mile gauntlet with the I-81 </w:t>
       </w:r>
-      <w:proofErr w:type="gramStart"/>
-      <w:r>
-        <w:t>concurrency</w:t>
-      </w:r>
-      <w:proofErr w:type="gramEnd"/>
-      <w:r>
-        <w:t>).</w:t>
+      <w:r>
+        <w:t>concurrency).</w:t>
       </w:r>
     </w:p>
     <w:p>
@@ -13883,7 +14048,21 @@
           <w:b/>
           <w:bCs/>
         </w:rPr>
-        <w:t>STEM Majors (Jordan, Aubrie, Zoe, Mark, Hannah):</w:t>
+        <w:t xml:space="preserve">STEM Majors (Jordan, Aubrie, </w:t>
+      </w:r>
+      <w:r>
+        <w:rPr>
+          <w:b/>
+          <w:bCs/>
+        </w:rPr>
+        <w:t>Zoë</w:t>
+      </w:r>
+      <w:r>
+        <w:rPr>
+          <w:b/>
+          <w:bCs/>
+        </w:rPr>
+        <w:t>, Mark, Hannah):</w:t>
       </w:r>
       <w:r>
         <w:t xml:space="preserve"> These five are enrolled in </w:t>
@@ -14028,7 +14207,14 @@
           <w:b/>
           <w:bCs/>
         </w:rPr>
-        <w:t>Zoe (Industrial &amp; Systems Engineering):</w:t>
+        <w:t>Zoë</w:t>
+      </w:r>
+      <w:r>
+        <w:rPr>
+          <w:b/>
+          <w:bCs/>
+        </w:rPr>
+        <w:t xml:space="preserve"> (Industrial &amp; Systems Engineering):</w:t>
       </w:r>
       <w:r>
         <w:t xml:space="preserve"> Shares SOC 101, ENG 102, and MATH 211. Her other classes are introductory ISE and engineering-specific courses.</w:t>
@@ -14802,7 +14988,10 @@
         <w:pStyle w:val="Heading3"/>
       </w:pPr>
       <w:r>
-        <w:t>Zoe's Schedule (Industrial &amp; Systems Engineering)</w:t>
+        <w:t>Zoë</w:t>
+      </w:r>
+      <w:r>
+        <w:t>'s Schedule (Industrial &amp; Systems Engineering)</w:t>
       </w:r>
     </w:p>
     <w:p>
@@ -17213,7 +17402,13 @@
       </w:r>
       <w:proofErr w:type="gramEnd"/>
       <w:r>
-        <w:t xml:space="preserve"> Zoe calls 911 and sends a [MEDICAL] [URGENT] alert to the Jordan Comms chat.</w:t>
+        <w:t xml:space="preserve"> </w:t>
+      </w:r>
+      <w:r>
+        <w:t>Zoë</w:t>
+      </w:r>
+      <w:r>
+        <w:t xml:space="preserve"> calls 911 and sends a [MEDICAL] [URGENT] alert to the Jordan Comms chat.</w:t>
       </w:r>
     </w:p>
     <w:p>
@@ -17707,7 +17902,14 @@
           <w:b/>
           <w:bCs/>
         </w:rPr>
-        <w:t>Zoe's turn</w:t>
+        <w:t>Zoë</w:t>
+      </w:r>
+      <w:r>
+        <w:rPr>
+          <w:b/>
+          <w:bCs/>
+        </w:rPr>
+        <w:t>'s turn</w:t>
       </w:r>
       <w:r>
         <w:t xml:space="preserve"> in the overnight rotation. Just as she gets settled for the night, the </w:t>
@@ -17738,7 +17940,13 @@
         <w:t>Overnight Visitor:</w:t>
       </w:r>
       <w:r>
-        <w:t xml:space="preserve"> Zoe is now officially </w:t>
+        <w:t xml:space="preserve"> </w:t>
+      </w:r>
+      <w:r>
+        <w:t>Zoë</w:t>
+      </w:r>
+      <w:r>
+        <w:t xml:space="preserve"> is now officially </w:t>
       </w:r>
       <w:proofErr w:type="gramStart"/>
       <w:r>
@@ -17801,7 +18009,13 @@
         <w:t>Narrative Focus:</w:t>
       </w:r>
       <w:r>
-        <w:t xml:space="preserve"> Jordan is weak, in pain, and vulnerable. Zoe is his sole caregiver. This extended, unplanned isolation forces them to connect on a deeper level. He explores his new romantic feelings for her, and she, in turn, provides the logical comfort he needs, all with Aubrie's full blessing via the Jordan Comms chat.</w:t>
+        <w:t xml:space="preserve"> Jordan is weak, in pain, and vulnerable. </w:t>
+      </w:r>
+      <w:r>
+        <w:t>Zoë</w:t>
+      </w:r>
+      <w:r>
+        <w:t xml:space="preserve"> is his sole caregiver. This extended, unplanned isolation forces them to connect on a deeper level. He explores his new romantic feelings for her, and she, in turn, provides the logical comfort he needs, all with Aubrie's full blessing via the Jordan Comms chat.</w:t>
       </w:r>
     </w:p>
     <w:p>
@@ -17842,7 +18056,13 @@
       </w:r>
       <w:proofErr w:type="gramEnd"/>
       <w:r>
-        <w:t xml:space="preserve"> The city is digging out. Jordan's recovery continues, as does his bond with Zoe. His scheduled discharge for Friday is officially postponed.</w:t>
+        <w:t xml:space="preserve"> The city is digging out. Jordan's recovery continues, as does his bond with </w:t>
+      </w:r>
+      <w:r>
+        <w:t>Zoë</w:t>
+      </w:r>
+      <w:r>
+        <w:t>. His scheduled discharge for Friday is officially postponed.</w:t>
       </w:r>
     </w:p>
     <w:p>
@@ -17921,15 +18141,7 @@
         <w:t>Overnight Visitor:</w:t>
       </w:r>
       <w:r>
-        <w:t xml:space="preserve"> The highways (like I-81) </w:t>
-      </w:r>
-      <w:proofErr w:type="gramStart"/>
-      <w:r>
-        <w:t>are finally</w:t>
-      </w:r>
-      <w:proofErr w:type="gramEnd"/>
-      <w:r>
-        <w:t xml:space="preserve"> clear enough for Daniel to drive </w:t>
+        <w:t xml:space="preserve"> The highways (like I-81) are finally clear enough for Daniel to drive </w:t>
       </w:r>
       <w:r>
         <w:rPr>
@@ -17939,7 +18151,13 @@
         <w:t>Sarah</w:t>
       </w:r>
       <w:r>
-        <w:t xml:space="preserve"> to the hospital to take her turn in the rotation, swapping with a very tired Zoe.</w:t>
+        <w:t xml:space="preserve"> to the hospital to take her turn in the rotation, swapping with a very tired </w:t>
+      </w:r>
+      <w:r>
+        <w:t>Zoë</w:t>
+      </w:r>
+      <w:r>
+        <w:t>.</w:t>
       </w:r>
     </w:p>
     <w:p>
@@ -18087,7 +18305,13 @@
         <w:t>:</w:t>
       </w:r>
       <w:r>
-        <w:t xml:space="preserve"> The group is horrified. Zoe immediately points out that </w:t>
+        <w:t xml:space="preserve"> The group is horrified. </w:t>
+      </w:r>
+      <w:r>
+        <w:t>Zoë</w:t>
+      </w:r>
+      <w:r>
+        <w:t xml:space="preserve"> immediately points out that </w:t>
       </w:r>
       <w:r>
         <w:rPr>
@@ -18177,15 +18401,7 @@
         <w:t>agrees to be driven home by Daniel</w:t>
       </w:r>
       <w:r>
-        <w:t xml:space="preserve">. The convoy heads back to </w:t>
-      </w:r>
-      <w:proofErr w:type="gramStart"/>
-      <w:r>
-        <w:t>the Brooks</w:t>
-      </w:r>
-      <w:proofErr w:type="gramEnd"/>
-      <w:r>
-        <w:t>' basement in Christiansburg.</w:t>
+        <w:t>. The convoy heads back to the Brooks' basement in Christiansburg.</w:t>
       </w:r>
     </w:p>
     <w:p>
@@ -18918,29 +19134,110 @@
         <w:rPr>
           <w:rFonts w:ascii="Aptos" w:eastAsia="Aptos" w:hAnsi="Aptos" w:cs="Aptos"/>
         </w:rPr>
-        <w:t xml:space="preserve">. That single </w:t>
+        <w:t>. That single word—"cripple"—settles it for Megan. "Get out," she says, her voice cold as ice. He tries to argue, to grab her arm. "I said, GET OUT." She decisively "ends the relationship" and "slams the front door in his face".</w:t>
+      </w:r>
+    </w:p>
+    <w:p>
+      <w:pPr>
+        <w:pStyle w:val="Heading2"/>
+      </w:pPr>
+      <w:r>
+        <w:t>Part 4: The Pact of 6 (The Aftermath)</w:t>
+      </w:r>
+    </w:p>
+    <w:p>
+      <w:pPr>
+        <w:pStyle w:val="ListParagraph"/>
+        <w:numPr>
+          <w:ilvl w:val="0"/>
+          <w:numId w:val="7"/>
+        </w:numPr>
+        <w:spacing w:before="240" w:after="240"/>
+        <w:rPr>
+          <w:rFonts w:ascii="Aptos" w:eastAsia="Aptos" w:hAnsi="Aptos" w:cs="Aptos"/>
+        </w:rPr>
+      </w:pPr>
+      <w:r>
+        <w:rPr>
+          <w:rFonts w:ascii="Aptos" w:eastAsia="Aptos" w:hAnsi="Aptos" w:cs="Aptos"/>
+          <w:b/>
+          <w:bCs/>
+        </w:rPr>
+        <w:t>The Retreat:</w:t>
+      </w:r>
+      <w:r>
+        <w:rPr>
+          <w:rFonts w:ascii="Aptos" w:eastAsia="Aptos" w:hAnsi="Aptos" w:cs="Aptos"/>
+        </w:rPr>
+        <w:t xml:space="preserve"> Megan, shaking with rage and hurt, walks back through the house and down the internal stairs to the basement.</w:t>
+      </w:r>
+    </w:p>
+    <w:p>
+      <w:pPr>
+        <w:pStyle w:val="ListParagraph"/>
+        <w:numPr>
+          <w:ilvl w:val="0"/>
+          <w:numId w:val="7"/>
+        </w:numPr>
+        <w:spacing w:before="240" w:after="240"/>
+        <w:rPr>
+          <w:rFonts w:ascii="Aptos" w:eastAsia="Aptos" w:hAnsi="Aptos" w:cs="Aptos"/>
+        </w:rPr>
+      </w:pPr>
+      <w:r>
+        <w:rPr>
+          <w:rFonts w:ascii="Aptos" w:eastAsia="Aptos" w:hAnsi="Aptos" w:cs="Aptos"/>
+          <w:b/>
+          <w:bCs/>
+        </w:rPr>
+        <w:t>The Safe Harbor:</w:t>
+      </w:r>
+      <w:r>
+        <w:rPr>
+          <w:rFonts w:ascii="Aptos" w:eastAsia="Aptos" w:hAnsi="Aptos" w:cs="Aptos"/>
+        </w:rPr>
+        <w:t xml:space="preserve"> Jordan is on the king-sized bed, surrounded by the pact, watching a movie. He sees her face and immediately opens his arms. "Megan? What's wrong?"</w:t>
+      </w:r>
+    </w:p>
+    <w:p>
+      <w:pPr>
+        <w:pStyle w:val="ListParagraph"/>
+        <w:numPr>
+          <w:ilvl w:val="0"/>
+          <w:numId w:val="7"/>
+        </w:numPr>
+        <w:spacing w:before="240" w:after="240"/>
+        <w:rPr>
+          <w:rFonts w:ascii="Aptos" w:eastAsia="Aptos" w:hAnsi="Aptos" w:cs="Aptos"/>
+        </w:rPr>
+      </w:pPr>
+      <w:r>
+        <w:rPr>
+          <w:rFonts w:ascii="Aptos" w:eastAsia="Aptos" w:hAnsi="Aptos" w:cs="Aptos"/>
+          <w:b/>
+          <w:bCs/>
+        </w:rPr>
+        <w:t>The Cuddle:</w:t>
+      </w:r>
+      <w:r>
+        <w:rPr>
+          <w:rFonts w:ascii="Aptos" w:eastAsia="Aptos" w:hAnsi="Aptos" w:cs="Aptos"/>
+        </w:rPr>
+        <w:t xml:space="preserve"> She "needs Jordan to cuddle with her". She goes straight to </w:t>
       </w:r>
       <w:proofErr w:type="gramStart"/>
       <w:r>
         <w:rPr>
           <w:rFonts w:ascii="Aptos" w:eastAsia="Aptos" w:hAnsi="Aptos" w:cs="Aptos"/>
         </w:rPr>
-        <w:t>word—"cripple"—</w:t>
+        <w:t>the bed</w:t>
       </w:r>
       <w:proofErr w:type="gramEnd"/>
       <w:r>
         <w:rPr>
           <w:rFonts w:ascii="Aptos" w:eastAsia="Aptos" w:hAnsi="Aptos" w:cs="Aptos"/>
         </w:rPr>
-        <w:t>settles it for Megan. "Get out," she says, her voice cold as ice. He tries to argue, to grab her arm. "I said, GET OUT." She decisively "ends the relationship" and "slams the front door in his face".</w:t>
-      </w:r>
-    </w:p>
-    <w:p>
-      <w:pPr>
-        <w:pStyle w:val="Heading2"/>
-      </w:pPr>
-      <w:r>
-        <w:t>Part 4: The Pact of 6 (The Aftermath)</w:t>
+        <w:t>, climbs in, and buries her face in his shoulder, crying. He happily holds her.</w:t>
       </w:r>
     </w:p>
     <w:p>
@@ -18961,13 +19258,25 @@
           <w:b/>
           <w:bCs/>
         </w:rPr>
-        <w:t>The Retreat:</w:t>
+        <w:t>The Invitation:</w:t>
       </w:r>
       <w:r>
         <w:rPr>
           <w:rFonts w:ascii="Aptos" w:eastAsia="Aptos" w:hAnsi="Aptos" w:cs="Aptos"/>
         </w:rPr>
-        <w:t xml:space="preserve"> Megan, shaking with rage and hurt, walks back through the house and down the internal stairs to the basement.</w:t>
+        <w:t xml:space="preserve"> Aubrie and </w:t>
+      </w:r>
+      <w:r>
+        <w:rPr>
+          <w:rFonts w:ascii="Aptos" w:eastAsia="Aptos" w:hAnsi="Aptos" w:cs="Aptos"/>
+        </w:rPr>
+        <w:t>Zoë</w:t>
+      </w:r>
+      <w:r>
+        <w:rPr>
+          <w:rFonts w:ascii="Aptos" w:eastAsia="Aptos" w:hAnsi="Aptos" w:cs="Aptos"/>
+        </w:rPr>
+        <w:t xml:space="preserve"> exchange a knowing look. They, along with the rest of the pact, surround Megan. "Megan," Aubrie says softly. "You don't need guys like that. You have us."</w:t>
       </w:r>
     </w:p>
     <w:p>
@@ -18988,108 +19297,25 @@
           <w:b/>
           <w:bCs/>
         </w:rPr>
-        <w:t>The Safe Harbor:</w:t>
+        <w:t>The Acceptance:</w:t>
       </w:r>
       <w:r>
         <w:rPr>
           <w:rFonts w:ascii="Aptos" w:eastAsia="Aptos" w:hAnsi="Aptos" w:cs="Aptos"/>
         </w:rPr>
-        <w:t xml:space="preserve"> Jordan is on the king-sized bed, surrounded by the pact, watching a movie. He sees her face and immediately opens his arms. "Megan? What's wrong?"</w:t>
-      </w:r>
-    </w:p>
-    <w:p>
-      <w:pPr>
-        <w:pStyle w:val="ListParagraph"/>
-        <w:numPr>
-          <w:ilvl w:val="0"/>
-          <w:numId w:val="7"/>
-        </w:numPr>
-        <w:spacing w:before="240" w:after="240"/>
+        <w:t xml:space="preserve"> </w:t>
+      </w:r>
+      <w:r>
         <w:rPr>
           <w:rFonts w:ascii="Aptos" w:eastAsia="Aptos" w:hAnsi="Aptos" w:cs="Aptos"/>
         </w:rPr>
-      </w:pPr>
+        <w:t>Zoë</w:t>
+      </w:r>
       <w:r>
         <w:rPr>
           <w:rFonts w:ascii="Aptos" w:eastAsia="Aptos" w:hAnsi="Aptos" w:cs="Aptos"/>
-          <w:b/>
-          <w:bCs/>
-        </w:rPr>
-        <w:t>The Cuddle:</w:t>
-      </w:r>
-      <w:r>
-        <w:rPr>
-          <w:rFonts w:ascii="Aptos" w:eastAsia="Aptos" w:hAnsi="Aptos" w:cs="Aptos"/>
-        </w:rPr>
-        <w:t xml:space="preserve"> She "needs Jordan to cuddle with her". She goes straight to </w:t>
-      </w:r>
-      <w:proofErr w:type="gramStart"/>
-      <w:r>
-        <w:rPr>
-          <w:rFonts w:ascii="Aptos" w:eastAsia="Aptos" w:hAnsi="Aptos" w:cs="Aptos"/>
-        </w:rPr>
-        <w:t>the bed</w:t>
-      </w:r>
-      <w:proofErr w:type="gramEnd"/>
-      <w:r>
-        <w:rPr>
-          <w:rFonts w:ascii="Aptos" w:eastAsia="Aptos" w:hAnsi="Aptos" w:cs="Aptos"/>
-        </w:rPr>
-        <w:t>, climbs in, and buries her face in his shoulder, crying. He happily holds her.</w:t>
-      </w:r>
-    </w:p>
-    <w:p>
-      <w:pPr>
-        <w:pStyle w:val="ListParagraph"/>
-        <w:numPr>
-          <w:ilvl w:val="0"/>
-          <w:numId w:val="7"/>
-        </w:numPr>
-        <w:spacing w:before="240" w:after="240"/>
-        <w:rPr>
-          <w:rFonts w:ascii="Aptos" w:eastAsia="Aptos" w:hAnsi="Aptos" w:cs="Aptos"/>
-        </w:rPr>
-      </w:pPr>
-      <w:r>
-        <w:rPr>
-          <w:rFonts w:ascii="Aptos" w:eastAsia="Aptos" w:hAnsi="Aptos" w:cs="Aptos"/>
-          <w:b/>
-          <w:bCs/>
-        </w:rPr>
-        <w:t>The Invitation:</w:t>
-      </w:r>
-      <w:r>
-        <w:rPr>
-          <w:rFonts w:ascii="Aptos" w:eastAsia="Aptos" w:hAnsi="Aptos" w:cs="Aptos"/>
-        </w:rPr>
-        <w:t xml:space="preserve"> Aubrie and Zoe exchange a knowing look. They, along with the rest of the pact, surround Megan. "Megan," Aubrie says softly. "You don't need guys like that. You have us."</w:t>
-      </w:r>
-    </w:p>
-    <w:p>
-      <w:pPr>
-        <w:pStyle w:val="ListParagraph"/>
-        <w:numPr>
-          <w:ilvl w:val="0"/>
-          <w:numId w:val="7"/>
-        </w:numPr>
-        <w:spacing w:before="240" w:after="240"/>
-        <w:rPr>
-          <w:rFonts w:ascii="Aptos" w:eastAsia="Aptos" w:hAnsi="Aptos" w:cs="Aptos"/>
-        </w:rPr>
-      </w:pPr>
-      <w:r>
-        <w:rPr>
-          <w:rFonts w:ascii="Aptos" w:eastAsia="Aptos" w:hAnsi="Aptos" w:cs="Aptos"/>
-          <w:b/>
-          <w:bCs/>
-        </w:rPr>
-        <w:t>The Acceptance:</w:t>
-      </w:r>
-      <w:r>
-        <w:rPr>
-          <w:rFonts w:ascii="Aptos" w:eastAsia="Aptos" w:hAnsi="Aptos" w:cs="Aptos"/>
-        </w:rPr>
-        <w:t xml:space="preserve"> Zoe adds, "Our system is more stable. You belong here." Jordan and the Pact of 5 </w:t>
+        </w:rPr>
+        <w:t xml:space="preserve"> adds, "Our system is more stable. You belong here." Jordan and the Pact of 5 </w:t>
       </w:r>
       <w:r>
         <w:rPr>
@@ -19387,21 +19613,7 @@
         <w:rPr>
           <w:rFonts w:ascii="Aptos" w:eastAsia="Aptos" w:hAnsi="Aptos" w:cs="Aptos"/>
         </w:rPr>
-        <w:t>Sexual activity is considered a "strenuous physical activity,</w:t>
-      </w:r>
-      <w:proofErr w:type="gramStart"/>
-      <w:r>
-        <w:rPr>
-          <w:rFonts w:ascii="Aptos" w:eastAsia="Aptos" w:hAnsi="Aptos" w:cs="Aptos"/>
-        </w:rPr>
-        <w:t>" much</w:t>
-      </w:r>
-      <w:proofErr w:type="gramEnd"/>
-      <w:r>
-        <w:rPr>
-          <w:rFonts w:ascii="Aptos" w:eastAsia="Aptos" w:hAnsi="Aptos" w:cs="Aptos"/>
-        </w:rPr>
-        <w:t xml:space="preserve"> like jogging or heavy lifting. It puts significant strain on the arms, back, and chest muscles.</w:t>
+        <w:t>Sexual activity is considered a "strenuous physical activity," much like jogging or heavy lifting. It puts significant strain on the arms, back, and chest muscles.</w:t>
       </w:r>
     </w:p>
     <w:p>
@@ -19552,7 +19764,19 @@
         <w:rPr>
           <w:rFonts w:ascii="Aptos" w:eastAsia="Aptos" w:hAnsi="Aptos" w:cs="Aptos"/>
         </w:rPr>
-        <w:t xml:space="preserve"> be sexual. Just like with Zoe in the hospital, her new relationship with Jordan will be defined purely by romantic (non-strenuous) </w:t>
+        <w:t xml:space="preserve"> be sexual. Just like with </w:t>
+      </w:r>
+      <w:r>
+        <w:rPr>
+          <w:rFonts w:ascii="Aptos" w:eastAsia="Aptos" w:hAnsi="Aptos" w:cs="Aptos"/>
+        </w:rPr>
+        <w:t>Zoë</w:t>
+      </w:r>
+      <w:r>
+        <w:rPr>
+          <w:rFonts w:ascii="Aptos" w:eastAsia="Aptos" w:hAnsi="Aptos" w:cs="Aptos"/>
+        </w:rPr>
+        <w:t xml:space="preserve"> in the hospital, her new relationship with Jordan will be defined purely by romantic (non-strenuous) </w:t>
       </w:r>
       <w:r>
         <w:rPr>
@@ -19609,11 +19833,25 @@
         <w:rPr>
           <w:rFonts w:ascii="Aptos" w:eastAsia="Aptos" w:hAnsi="Aptos" w:cs="Aptos"/>
         </w:rPr>
-        <w:t xml:space="preserve"> is made and entered into this </w:t>
-      </w:r>
+        <w:t xml:space="preserve"> is made and entered </w:t>
+      </w:r>
+      <w:proofErr w:type="gramStart"/>
       <w:r>
         <w:rPr>
           <w:rFonts w:ascii="Aptos" w:eastAsia="Aptos" w:hAnsi="Aptos" w:cs="Aptos"/>
+        </w:rPr>
+        <w:t>into</w:t>
+      </w:r>
+      <w:proofErr w:type="gramEnd"/>
+      <w:r>
+        <w:rPr>
+          <w:rFonts w:ascii="Aptos" w:eastAsia="Aptos" w:hAnsi="Aptos" w:cs="Aptos"/>
+        </w:rPr>
+        <w:t xml:space="preserve"> this </w:t>
+      </w:r>
+      <w:r>
+        <w:rPr>
+          <w:rFonts w:ascii="Aptos" w:eastAsia="Aptos" w:hAnsi="Aptos" w:cs="Aptos"/>
           <w:b/>
           <w:bCs/>
         </w:rPr>
@@ -19777,16 +20015,8 @@
         <w:rPr>
           <w:rFonts w:ascii="Aptos" w:eastAsia="Aptos" w:hAnsi="Aptos" w:cs="Aptos"/>
         </w:rPr>
-        <w:t xml:space="preserve"> the Donor wishes to ensure that the home of the Forgers remains a sanctuary of intimidation, noise, and iron-willed tradition for all </w:t>
-      </w:r>
-      <w:proofErr w:type="gramStart"/>
-      <w:r>
-        <w:rPr>
-          <w:rFonts w:ascii="Aptos" w:eastAsia="Aptos" w:hAnsi="Aptos" w:cs="Aptos"/>
-        </w:rPr>
-        <w:t>time;</w:t>
-      </w:r>
-      <w:proofErr w:type="gramEnd"/>
+        <w:t xml:space="preserve"> the Donor wishes to ensure that the home of the Forgers remains a sanctuary of intimidation, noise, and iron-willed tradition for all time;</w:t>
+      </w:r>
     </w:p>
     <w:p>
       <w:pPr>
@@ -20762,23 +20992,7 @@
           <w:i/>
           <w:iCs/>
         </w:rPr>
-        <w:t xml:space="preserve">All units are New Flyer </w:t>
-      </w:r>
-      <w:proofErr w:type="spellStart"/>
-      <w:r>
-        <w:rPr>
-          <w:i/>
-          <w:iCs/>
-        </w:rPr>
-        <w:t>Xcelsior</w:t>
-      </w:r>
-      <w:proofErr w:type="spellEnd"/>
-      <w:r>
-        <w:rPr>
-          <w:i/>
-          <w:iCs/>
-        </w:rPr>
-        <w:t xml:space="preserve"> Clean Diesel (XD) Low Floor models. All drivers hold Class A CDLs with Passenger/Air Brake endorsements and current DOT Medical Cards.</w:t>
+        <w:t>All units are New Flyer Xcelsior Clean Diesel (XD) Low Floor models. All drivers hold Class A CDLs with Passenger/Air Brake endorsements and current DOT Medical Cards.</w:t>
       </w:r>
     </w:p>
     <w:tbl>
@@ -20905,7 +21119,13 @@
               <w:spacing w:after="160" w:line="278" w:lineRule="auto"/>
             </w:pPr>
             <w:r>
-              <w:t>"The Zoe"</w:t>
+              <w:t xml:space="preserve">"The </w:t>
+            </w:r>
+            <w:r>
+              <w:t>Zoë</w:t>
+            </w:r>
+            <w:r>
+              <w:t>"</w:t>
             </w:r>
           </w:p>
         </w:tc>
@@ -21792,7 +22012,21 @@
                 <w:i/>
                 <w:iCs/>
               </w:rPr>
-              <w:t>(Formerly "The Zoe")</w:t>
+              <w:t xml:space="preserve">(Formerly "The </w:t>
+            </w:r>
+            <w:r>
+              <w:rPr>
+                <w:i/>
+                <w:iCs/>
+              </w:rPr>
+              <w:t>Zoë</w:t>
+            </w:r>
+            <w:r>
+              <w:rPr>
+                <w:i/>
+                <w:iCs/>
+              </w:rPr>
+              <w:t>")</w:t>
             </w:r>
           </w:p>
         </w:tc>

</xml_diff>